<commit_message>
docs: rapikan file PRD - v2 jadi nama utama, hapus duplikat
</commit_message>
<xml_diff>
--- a/docs/PRD - Aplikasi Belajar SIBI.docx
+++ b/docs/PRD - Aplikasi Belajar SIBI.docx
@@ -312,6 +312,14 @@
         <w:pStyle w:val="ListNumber"/>
       </w:pPr>
       <w:r>
+        <w:t>Kriteria pemilihan 15-20 kata: kata dasar sehari-hari yang paling relevan untuk komunikasi awal (sapaan, kebutuhan dasar), dipilih yang gesturnya statis bila memungkinkan, dan bersumber dari Kamus SIBI resmi. Daftar final ditentukan di fase riset (P4) dan dicatat sebagai konten katalog.</w:t>
+      </w:r>
+    </w:p>
+    <w:p>
+      <w:pPr>
+        <w:pStyle w:val="ListNumber"/>
+      </w:pPr>
+      <w:r>
         <w:t>Katalog gestur data-driven: setiap gestur adalah data {id, label, sistem [SIBI], jumlah_tangan: 1, gambar_panduan, teks_langkah, aturan_geometris?}. Memungkinkan BISINDO (2 tangan) ditambahkan sebagai sistem baru.</w:t>
       </w:r>
     </w:p>
@@ -400,7 +408,348 @@
         <w:pStyle w:val="Heading2"/>
       </w:pPr>
       <w:r>
-        <w:t>5. Testing Decisions</w:t>
+        <w:t>5. Non-Functional Requirements</w:t>
+      </w:r>
+    </w:p>
+    <w:p>
+      <w:pPr>
+        <w:pStyle w:val="ListBullet"/>
+      </w:pPr>
+      <w:r>
+        <w:t>Browser didukung: Chrome versi terbaru (dan browser Chromium lain seperti Edge). Target utama kamera + MediaPipe, jadi browser modern diutamakan.</w:t>
+      </w:r>
+    </w:p>
+    <w:p>
+      <w:pPr>
+        <w:pStyle w:val="ListBullet"/>
+      </w:pPr>
+      <w:r>
+        <w:t>Performa: aplikasi merespons penilaian dalam &lt;1 detik dari gestur stabil; frame rate kamera tetap halus (&gt;=15 fps di laptop standar) saat mode latihan.</w:t>
+      </w:r>
+    </w:p>
+    <w:p>
+      <w:pPr>
+        <w:pStyle w:val="ListBullet"/>
+      </w:pPr>
+      <w:r>
+        <w:t>Privasi: semua proses pengenalan berjalan di perangkat pengguna (client-side); video kamera tidak direkam, tidak dikirim ke server, tidak dipersist. Ada indikator jelas saat kamera aktif.</w:t>
+      </w:r>
+    </w:p>
+    <w:p>
+      <w:pPr>
+        <w:pStyle w:val="ListBullet"/>
+      </w:pPr>
+      <w:r>
+        <w:t>Penanganan error: saat kamera tidak tersedia / izin ditolak / tidak ada tangan terdeteksi / model gagal dimuat, aplikasi menampilkan pesan ramah yang jelas + opsi lanjut ke mode tanpa kamera (bukan error diam-diam).</w:t>
+      </w:r>
+    </w:p>
+    <w:p>
+      <w:pPr>
+        <w:pStyle w:val="ListBullet"/>
+      </w:pPr>
+      <w:r>
+        <w:t>Tersedia offline-ish: mode tanpa kamera memungkinkan pengguna melihat materi &amp; panduan tanpa akses kamera.</w:t>
+      </w:r>
+    </w:p>
+    <w:p>
+      <w:pPr>
+        <w:pStyle w:val="ListBullet"/>
+      </w:pPr>
+      <w:r>
+        <w:t>Aksesibilitas dasar: kontras teks memadai untuk gangguan penglihatan ringan; ukuran font &amp; target sentuh layak di layar HP.</w:t>
+      </w:r>
+    </w:p>
+    <w:p>
+      <w:pPr>
+        <w:pStyle w:val="Heading2"/>
+      </w:pPr>
+      <w:r>
+        <w:t>6. Risks &amp; Mitigations</w:t>
+      </w:r>
+    </w:p>
+    <w:tbl>
+      <w:tblPr>
+        <w:tblStyle w:val="TableGrid"/>
+        <w:tblW w:type="auto" w:w="0"/>
+        <w:tblLook w:firstColumn="1" w:firstRow="1" w:lastColumn="0" w:lastRow="0" w:noHBand="0" w:noVBand="1" w:val="04A0"/>
+      </w:tblPr>
+      <w:tblGrid>
+        <w:gridCol w:w="3135"/>
+        <w:gridCol w:w="3135"/>
+        <w:gridCol w:w="3135"/>
+      </w:tblGrid>
+      <w:tr>
+        <w:tc>
+          <w:tcPr>
+            <w:tcW w:type="dxa" w:w="3135"/>
+          </w:tcPr>
+          <w:p>
+            <w:r>
+              <w:rPr>
+                <w:b/>
+              </w:rPr>
+              <w:t>Risiko</w:t>
+            </w:r>
+          </w:p>
+        </w:tc>
+        <w:tc>
+          <w:tcPr>
+            <w:tcW w:type="dxa" w:w="3135"/>
+          </w:tcPr>
+          <w:p>
+            <w:r>
+              <w:rPr>
+                <w:b/>
+              </w:rPr>
+              <w:t>Dampak</w:t>
+            </w:r>
+          </w:p>
+        </w:tc>
+        <w:tc>
+          <w:tcPr>
+            <w:tcW w:type="dxa" w:w="3135"/>
+          </w:tcPr>
+          <w:p>
+            <w:r>
+              <w:rPr>
+                <w:b/>
+              </w:rPr>
+              <w:t>Mitigasi</w:t>
+            </w:r>
+          </w:p>
+        </w:tc>
+      </w:tr>
+      <w:tr>
+        <w:tc>
+          <w:tcPr>
+            <w:tcW w:type="dxa" w:w="3135"/>
+          </w:tcPr>
+          <w:p>
+            <w:r>
+              <w:t>Dataset rekam sendiri telat / kurang</w:t>
+            </w:r>
+          </w:p>
+        </w:tc>
+        <w:tc>
+          <w:tcPr>
+            <w:tcW w:type="dxa" w:w="3135"/>
+          </w:tcPr>
+          <w:p>
+            <w:r>
+              <w:t>Model akurasi rendah, jadwal mundur</w:t>
+            </w:r>
+          </w:p>
+        </w:tc>
+        <w:tc>
+          <w:tcPr>
+            <w:tcW w:type="dxa" w:w="3135"/>
+          </w:tcPr>
+          <w:p>
+            <w:r>
+              <w:t>Mulai rekam di P5-6 (jalur kritis); target +/-100 frame/gestur; dataset ASL publik untuk prototyping awal</w:t>
+            </w:r>
+          </w:p>
+        </w:tc>
+      </w:tr>
+      <w:tr>
+        <w:tc>
+          <w:tcPr>
+            <w:tcW w:type="dxa" w:w="3135"/>
+          </w:tcPr>
+          <w:p>
+            <w:r>
+              <w:t>Akurasi model &lt; target 85%</w:t>
+            </w:r>
+          </w:p>
+        </w:tc>
+        <w:tc>
+          <w:tcPr>
+            <w:tcW w:type="dxa" w:w="3135"/>
+          </w:tcPr>
+          <w:p>
+            <w:r>
+              <w:t>Tidak memenuhi target MVP</w:t>
+            </w:r>
+          </w:p>
+        </w:tc>
+        <w:tc>
+          <w:tcPr>
+            <w:tcW w:type="dxa" w:w="3135"/>
+          </w:tcPr>
+          <w:p>
+            <w:r>
+              <w:t>Evaluasi dini (P7 gerbang); tambah data huruf yang sering salah; pangkas scope (kata jadi fase 2); sampaikan jujur ke dosen</w:t>
+            </w:r>
+          </w:p>
+        </w:tc>
+      </w:tr>
+      <w:tr>
+        <w:tc>
+          <w:tcPr>
+            <w:tcW w:type="dxa" w:w="3135"/>
+          </w:tcPr>
+          <w:p>
+            <w:r>
+              <w:t>BISINDO stretch tidak kesampaian</w:t>
+            </w:r>
+          </w:p>
+        </w:tc>
+        <w:tc>
+          <w:tcPr>
+            <w:tcW w:type="dxa" w:w="3135"/>
+          </w:tcPr>
+          <w:p>
+            <w:r>
+              <w:t>Tidak ada fitur BISINDO di MVP</w:t>
+            </w:r>
+          </w:p>
+        </w:tc>
+        <w:tc>
+          <w:tcPr>
+            <w:tcW w:type="dxa" w:w="3135"/>
+          </w:tcPr>
+          <w:p>
+            <w:r>
+              <w:t>BISINDO bukan janji (ADR-0005); arsitektur multi-sistem disiapkan; disebut pengembangan lanjutan di laporan</w:t>
+            </w:r>
+          </w:p>
+        </w:tc>
+      </w:tr>
+      <w:tr>
+        <w:tc>
+          <w:tcPr>
+            <w:tcW w:type="dxa" w:w="3135"/>
+          </w:tcPr>
+          <w:p>
+            <w:r>
+              <w:t>Jadwal molor dari P12</w:t>
+            </w:r>
+          </w:p>
+        </w:tc>
+        <w:tc>
+          <w:tcPr>
+            <w:tcW w:type="dxa" w:w="3135"/>
+          </w:tcPr>
+          <w:p>
+            <w:r>
+              <w:t>MVP tidak siap demo akhir</w:t>
+            </w:r>
+          </w:p>
+        </w:tc>
+        <w:tc>
+          <w:tcPr>
+            <w:tcW w:type="dxa" w:w="3135"/>
+          </w:tcPr>
+          <w:p>
+            <w:r>
+              <w:t>Rencana cadangan: pangkas kata ke fase 2; nol fitur baru setelah P8; QA &amp; laporan paralel</w:t>
+            </w:r>
+          </w:p>
+        </w:tc>
+      </w:tr>
+      <w:tr>
+        <w:tc>
+          <w:tcPr>
+            <w:tcW w:type="dxa" w:w="3135"/>
+          </w:tcPr>
+          <w:p>
+            <w:r>
+              <w:t>Kamera bermasalah saat demo</w:t>
+            </w:r>
+          </w:p>
+        </w:tc>
+        <w:tc>
+          <w:tcPr>
+            <w:tcW w:type="dxa" w:w="3135"/>
+          </w:tcPr>
+          <w:p>
+            <w:r>
+              <w:t>Demo gagal di hari H</w:t>
+            </w:r>
+          </w:p>
+        </w:tc>
+        <w:tc>
+          <w:tcPr>
+            <w:tcW w:type="dxa" w:w="3135"/>
+          </w:tcPr>
+          <w:p>
+            <w:r>
+              <w:t>Mode uji dari file gambar + video demo cadangan (T9)</w:t>
+            </w:r>
+          </w:p>
+        </w:tc>
+      </w:tr>
+      <w:tr>
+        <w:tc>
+          <w:tcPr>
+            <w:tcW w:type="dxa" w:w="3135"/>
+          </w:tcPr>
+          <w:p>
+            <w:r>
+              <w:t>Validasi komunitas Tuli tidak didapat</w:t>
+            </w:r>
+          </w:p>
+        </w:tc>
+        <w:tc>
+          <w:tcPr>
+            <w:tcW w:type="dxa" w:w="3135"/>
+          </w:tcPr>
+          <w:p>
+            <w:r>
+              <w:t>Konten BISINDO berisiko salah versi</w:t>
+            </w:r>
+          </w:p>
+        </w:tc>
+        <w:tc>
+          <w:tcPr>
+            <w:tcW w:type="dxa" w:w="3135"/>
+          </w:tcPr>
+          <w:p>
+            <w:r>
+              <w:t>Untuk MVP SIBI tidak wajib (Kamus SIBI resmi); BISINDO hanya bila akses didapat</w:t>
+            </w:r>
+          </w:p>
+        </w:tc>
+      </w:tr>
+      <w:tr>
+        <w:tc>
+          <w:tcPr>
+            <w:tcW w:type="dxa" w:w="3135"/>
+          </w:tcPr>
+          <w:p>
+            <w:r>
+              <w:t>Salah satu tim tidak bisa lanjut</w:t>
+            </w:r>
+          </w:p>
+        </w:tc>
+        <w:tc>
+          <w:tcPr>
+            <w:tcW w:type="dxa" w:w="3135"/>
+          </w:tcPr>
+          <w:p>
+            <w:r>
+              <w:t>Beban menumpuk ke satu orang</w:t>
+            </w:r>
+          </w:p>
+        </w:tc>
+        <w:tc>
+          <w:tcPr>
+            <w:tcW w:type="dxa" w:w="3135"/>
+          </w:tcPr>
+          <w:p>
+            <w:r>
+              <w:t>Konten/riset/dokumentasi dipisah ke non-coding; batas tanggung jawab jelas</w:t>
+            </w:r>
+          </w:p>
+        </w:tc>
+      </w:tr>
+    </w:tbl>
+    <w:p>
+      <w:pPr>
+        <w:pStyle w:val="Heading2"/>
+      </w:pPr>
+      <w:r>
+        <w:t>7. Testing Decisions</w:t>
       </w:r>
     </w:p>
     <w:p>
@@ -453,6 +802,14 @@
         <w:pStyle w:val="ListBullet"/>
       </w:pPr>
       <w:r>
+        <w:t>Pengujian pengguna: minimum diuji oleh teman satu tim (QA manual terstruktur). Bila ada kesempatan (kenalan, teman kampus, komunitas), diuji ke 5-10 pembelajar nyata sebagai best effort untuk bahan laporan; bukan komitmen keras. Hasil pengujian dicatat jujur (apa yang berhasil, apa yang membingungkan).</w:t>
+      </w:r>
+    </w:p>
+    <w:p>
+      <w:pPr>
+        <w:pStyle w:val="ListBullet"/>
+      </w:pPr>
+      <w:r>
         <w:t>Tidak ada prior art karena repo greenfield; seam pengujian utama adalah modul logika produk yang murni (tanpa DOM/kamera), sehingga mudah diuji.</w:t>
       </w:r>
     </w:p>
@@ -461,7 +818,7 @@
         <w:pStyle w:val="Heading2"/>
       </w:pPr>
       <w:r>
-        <w:t>6. Out of Scope</w:t>
+        <w:t>8. Out of Scope</w:t>
       </w:r>
     </w:p>
     <w:p>
@@ -549,7 +906,7 @@
         <w:pStyle w:val="Heading2"/>
       </w:pPr>
       <w:r>
-        <w:t>7. Further Notes</w:t>
+        <w:t>9. Further Notes</w:t>
       </w:r>
     </w:p>
     <w:p>

</xml_diff>